<commit_message>
更新 MOSI/MMAffBen 圖表、v6-v7 圖檔與論文 v14/v18 docx
- docs/figures: 重繪 mosi acc7_ranking / multi_metric、v6_fig_distribution、
  v7_fig_arch；新增 mmaffben_avg_macroF1 圖表（PNG + SVG）
- docs: 新增 regenerate_mmaffben_avg_chart 與 fix_v18_figure_overlap 腳本，
  調整 make_mosi_bar / regenerate_v7_figures
- 論文 v14 / v18 docx 同步更新，前端 survey detail / CSS 微調

Co-Authored-By: Claude Opus 4.7 (1M context) <noreply@anthropic.com>
</commit_message>
<xml_diff>
--- a/論文＿李昇峰_v14.docx
+++ b/論文＿李昇峰_v14.docx
@@ -17689,13 +17689,13 @@
         <w:tblLook w:val="04A0" w:firstRow="1" w:lastRow="0" w:firstColumn="1" w:lastColumn="0" w:noHBand="0" w:noVBand="1"/>
       </w:tblPr>
       <w:tblGrid>
-        <w:gridCol w:w="1592"/>
-        <w:gridCol w:w="1164"/>
-        <w:gridCol w:w="1165"/>
-        <w:gridCol w:w="1165"/>
-        <w:gridCol w:w="1165"/>
-        <w:gridCol w:w="1165"/>
-        <w:gridCol w:w="886"/>
+        <w:gridCol w:w="1419"/>
+        <w:gridCol w:w="1151"/>
+        <w:gridCol w:w="1151"/>
+        <w:gridCol w:w="1151"/>
+        <w:gridCol w:w="1153"/>
+        <w:gridCol w:w="1151"/>
+        <w:gridCol w:w="1126"/>
       </w:tblGrid>
       <w:tr>
         <w:tc>
@@ -17705,9 +17705,17 @@
           </w:tcPr>
           <w:p>
             <w:pPr>
-              <w:ind w:firstLine="480"/>
-            </w:pPr>
-            <w:r>
+              <w:pStyle w:val="afb"/>
+              <w:rPr>
+                <w:b/>
+                <w:bCs/>
+              </w:rPr>
+            </w:pPr>
+            <w:r>
+              <w:rPr>
+                <w:b/>
+                <w:bCs/>
+              </w:rPr>
               <w:t>模型</w:t>
             </w:r>
           </w:p>
@@ -17719,9 +17727,17 @@
           </w:tcPr>
           <w:p>
             <w:pPr>
-              <w:ind w:firstLine="480"/>
-            </w:pPr>
-            <w:r>
+              <w:pStyle w:val="afb"/>
+              <w:rPr>
+                <w:b/>
+                <w:bCs/>
+              </w:rPr>
+            </w:pPr>
+            <w:r>
+              <w:rPr>
+                <w:b/>
+                <w:bCs/>
+              </w:rPr>
               <w:t>Acc-7 (↑)</w:t>
             </w:r>
           </w:p>
@@ -17733,9 +17749,17 @@
           </w:tcPr>
           <w:p>
             <w:pPr>
-              <w:ind w:firstLine="480"/>
-            </w:pPr>
-            <w:r>
+              <w:pStyle w:val="afb"/>
+              <w:rPr>
+                <w:b/>
+                <w:bCs/>
+              </w:rPr>
+            </w:pPr>
+            <w:r>
+              <w:rPr>
+                <w:b/>
+                <w:bCs/>
+              </w:rPr>
               <w:t>Acc-2 (↑)</w:t>
             </w:r>
           </w:p>
@@ -17747,9 +17771,17 @@
           </w:tcPr>
           <w:p>
             <w:pPr>
-              <w:ind w:firstLine="480"/>
-            </w:pPr>
-            <w:r>
+              <w:pStyle w:val="afb"/>
+              <w:rPr>
+                <w:b/>
+                <w:bCs/>
+              </w:rPr>
+            </w:pPr>
+            <w:r>
+              <w:rPr>
+                <w:b/>
+                <w:bCs/>
+              </w:rPr>
               <w:t>F1 (↑)</w:t>
             </w:r>
           </w:p>
@@ -17761,9 +17793,17 @@
           </w:tcPr>
           <w:p>
             <w:pPr>
-              <w:ind w:firstLine="480"/>
-            </w:pPr>
-            <w:r>
+              <w:pStyle w:val="afb"/>
+              <w:rPr>
+                <w:b/>
+                <w:bCs/>
+              </w:rPr>
+            </w:pPr>
+            <w:r>
+              <w:rPr>
+                <w:b/>
+                <w:bCs/>
+              </w:rPr>
               <w:t>MAE (↓)</w:t>
             </w:r>
           </w:p>
@@ -17775,9 +17815,17 @@
           </w:tcPr>
           <w:p>
             <w:pPr>
-              <w:ind w:firstLine="480"/>
-            </w:pPr>
-            <w:r>
+              <w:pStyle w:val="afb"/>
+              <w:rPr>
+                <w:b/>
+                <w:bCs/>
+              </w:rPr>
+            </w:pPr>
+            <w:r>
+              <w:rPr>
+                <w:b/>
+                <w:bCs/>
+              </w:rPr>
               <w:t>Corr (↑)</w:t>
             </w:r>
           </w:p>
@@ -17789,7 +17837,11 @@
           </w:tcPr>
           <w:p>
             <w:pPr>
-              <w:ind w:firstLine="480"/>
+              <w:pStyle w:val="afb"/>
+              <w:rPr>
+                <w:b/>
+                <w:bCs/>
+              </w:rPr>
             </w:pPr>
           </w:p>
         </w:tc>
@@ -17801,7 +17853,7 @@
           </w:tcPr>
           <w:p>
             <w:pPr>
-              <w:ind w:firstLine="480"/>
+              <w:pStyle w:val="afb"/>
             </w:pPr>
             <w:r>
               <w:t>LF-DNN</w:t>
@@ -17814,7 +17866,7 @@
           </w:tcPr>
           <w:p>
             <w:pPr>
-              <w:ind w:firstLine="480"/>
+              <w:pStyle w:val="afb"/>
             </w:pPr>
             <w:r>
               <w:t>33.6</w:t>
@@ -17827,7 +17879,7 @@
           </w:tcPr>
           <w:p>
             <w:pPr>
-              <w:ind w:firstLine="480"/>
+              <w:pStyle w:val="afb"/>
             </w:pPr>
             <w:r>
               <w:t>78.0</w:t>
@@ -17840,7 +17892,7 @@
           </w:tcPr>
           <w:p>
             <w:pPr>
-              <w:ind w:firstLine="480"/>
+              <w:pStyle w:val="afb"/>
             </w:pPr>
             <w:r>
               <w:t>77.5</w:t>
@@ -17853,7 +17905,7 @@
           </w:tcPr>
           <w:p>
             <w:pPr>
-              <w:ind w:firstLine="480"/>
+              <w:pStyle w:val="afb"/>
             </w:pPr>
             <w:r>
               <w:t>0.978</w:t>
@@ -17866,7 +17918,7 @@
           </w:tcPr>
           <w:p>
             <w:pPr>
-              <w:ind w:firstLine="480"/>
+              <w:pStyle w:val="afb"/>
             </w:pPr>
             <w:r>
               <w:t>0.658</w:t>
@@ -17879,7 +17931,7 @@
           </w:tcPr>
           <w:p>
             <w:pPr>
-              <w:ind w:firstLine="480"/>
+              <w:pStyle w:val="afb"/>
             </w:pPr>
           </w:p>
         </w:tc>
@@ -17891,7 +17943,7 @@
           </w:tcPr>
           <w:p>
             <w:pPr>
-              <w:ind w:firstLine="480"/>
+              <w:pStyle w:val="afb"/>
             </w:pPr>
             <w:r>
               <w:t>Graph-MFN</w:t>
@@ -17904,7 +17956,7 @@
           </w:tcPr>
           <w:p>
             <w:pPr>
-              <w:ind w:firstLine="480"/>
+              <w:pStyle w:val="afb"/>
             </w:pPr>
             <w:r>
               <w:t>34.4</w:t>
@@ -17917,7 +17969,7 @@
           </w:tcPr>
           <w:p>
             <w:pPr>
-              <w:ind w:firstLine="480"/>
+              <w:pStyle w:val="afb"/>
             </w:pPr>
             <w:r>
               <w:t>77.9</w:t>
@@ -17930,7 +17982,7 @@
           </w:tcPr>
           <w:p>
             <w:pPr>
-              <w:ind w:firstLine="480"/>
+              <w:pStyle w:val="afb"/>
             </w:pPr>
             <w:r>
               <w:t>77.8</w:t>
@@ -17943,7 +17995,7 @@
           </w:tcPr>
           <w:p>
             <w:pPr>
-              <w:ind w:firstLine="480"/>
+              <w:pStyle w:val="afb"/>
             </w:pPr>
             <w:r>
               <w:t>0.989</w:t>
@@ -17956,7 +18008,7 @@
           </w:tcPr>
           <w:p>
             <w:pPr>
-              <w:ind w:firstLine="480"/>
+              <w:pStyle w:val="afb"/>
             </w:pPr>
             <w:r>
               <w:t>0.656</w:t>
@@ -17969,7 +18021,7 @@
           </w:tcPr>
           <w:p>
             <w:pPr>
-              <w:ind w:firstLine="480"/>
+              <w:pStyle w:val="afb"/>
             </w:pPr>
           </w:p>
         </w:tc>
@@ -17981,7 +18033,7 @@
           </w:tcPr>
           <w:p>
             <w:pPr>
-              <w:ind w:firstLine="480"/>
+              <w:pStyle w:val="afb"/>
             </w:pPr>
             <w:r>
               <w:t>MFM</w:t>
@@ -17994,7 +18046,7 @@
           </w:tcPr>
           <w:p>
             <w:pPr>
-              <w:ind w:firstLine="480"/>
+              <w:pStyle w:val="afb"/>
             </w:pPr>
             <w:r>
               <w:t>33.3</w:t>
@@ -18007,7 +18059,7 @@
           </w:tcPr>
           <w:p>
             <w:pPr>
-              <w:ind w:firstLine="480"/>
+              <w:pStyle w:val="afb"/>
             </w:pPr>
             <w:r>
               <w:t>77.7</w:t>
@@ -18020,7 +18072,7 @@
           </w:tcPr>
           <w:p>
             <w:pPr>
-              <w:ind w:firstLine="480"/>
+              <w:pStyle w:val="afb"/>
             </w:pPr>
             <w:r>
               <w:t>77.7</w:t>
@@ -18033,7 +18085,7 @@
           </w:tcPr>
           <w:p>
             <w:pPr>
-              <w:ind w:firstLine="480"/>
+              <w:pStyle w:val="afb"/>
             </w:pPr>
             <w:r>
               <w:t>0.948</w:t>
@@ -18046,7 +18098,7 @@
           </w:tcPr>
           <w:p>
             <w:pPr>
-              <w:ind w:firstLine="480"/>
+              <w:pStyle w:val="afb"/>
             </w:pPr>
             <w:r>
               <w:t>0.664</w:t>
@@ -18059,7 +18111,7 @@
           </w:tcPr>
           <w:p>
             <w:pPr>
-              <w:ind w:firstLine="480"/>
+              <w:pStyle w:val="afb"/>
             </w:pPr>
           </w:p>
         </w:tc>
@@ -18071,7 +18123,7 @@
           </w:tcPr>
           <w:p>
             <w:pPr>
-              <w:ind w:firstLine="480"/>
+              <w:pStyle w:val="afb"/>
             </w:pPr>
             <w:r>
               <w:t>MISA</w:t>
@@ -18084,7 +18136,7 @@
           </w:tcPr>
           <w:p>
             <w:pPr>
-              <w:ind w:firstLine="480"/>
+              <w:pStyle w:val="afb"/>
             </w:pPr>
             <w:r>
               <w:t>43.5</w:t>
@@ -18097,7 +18149,7 @@
           </w:tcPr>
           <w:p>
             <w:pPr>
-              <w:ind w:firstLine="480"/>
+              <w:pStyle w:val="afb"/>
             </w:pPr>
             <w:r>
               <w:t>81.8</w:t>
@@ -18110,7 +18162,7 @@
           </w:tcPr>
           <w:p>
             <w:pPr>
-              <w:ind w:firstLine="480"/>
+              <w:pStyle w:val="afb"/>
             </w:pPr>
             <w:r>
               <w:t>81.7</w:t>
@@ -18123,7 +18175,7 @@
           </w:tcPr>
           <w:p>
             <w:pPr>
-              <w:ind w:firstLine="480"/>
+              <w:pStyle w:val="afb"/>
             </w:pPr>
             <w:r>
               <w:t>0.752</w:t>
@@ -18136,7 +18188,7 @@
           </w:tcPr>
           <w:p>
             <w:pPr>
-              <w:ind w:firstLine="480"/>
+              <w:pStyle w:val="afb"/>
             </w:pPr>
             <w:r>
               <w:t>0.784</w:t>
@@ -18149,7 +18201,7 @@
           </w:tcPr>
           <w:p>
             <w:pPr>
-              <w:ind w:firstLine="480"/>
+              <w:pStyle w:val="afb"/>
             </w:pPr>
           </w:p>
         </w:tc>
@@ -18161,7 +18213,7 @@
           </w:tcPr>
           <w:p>
             <w:pPr>
-              <w:ind w:firstLine="480"/>
+              <w:pStyle w:val="afb"/>
             </w:pPr>
             <w:r>
               <w:t>Self-MM</w:t>
@@ -18174,7 +18226,7 @@
           </w:tcPr>
           <w:p>
             <w:pPr>
-              <w:ind w:firstLine="480"/>
+              <w:pStyle w:val="afb"/>
             </w:pPr>
             <w:r>
               <w:t>45.8</w:t>
@@ -18187,7 +18239,7 @@
           </w:tcPr>
           <w:p>
             <w:pPr>
-              <w:ind w:firstLine="480"/>
+              <w:pStyle w:val="afb"/>
             </w:pPr>
             <w:r>
               <w:t>82.5</w:t>
@@ -18200,7 +18252,7 @@
           </w:tcPr>
           <w:p>
             <w:pPr>
-              <w:ind w:firstLine="480"/>
+              <w:pStyle w:val="afb"/>
             </w:pPr>
             <w:r>
               <w:t>82.6</w:t>
@@ -18213,7 +18265,7 @@
           </w:tcPr>
           <w:p>
             <w:pPr>
-              <w:ind w:firstLine="480"/>
+              <w:pStyle w:val="afb"/>
             </w:pPr>
             <w:r>
               <w:t>0.731</w:t>
@@ -18226,7 +18278,7 @@
           </w:tcPr>
           <w:p>
             <w:pPr>
-              <w:ind w:firstLine="480"/>
+              <w:pStyle w:val="afb"/>
             </w:pPr>
             <w:r>
               <w:t>0.785</w:t>
@@ -18239,7 +18291,7 @@
           </w:tcPr>
           <w:p>
             <w:pPr>
-              <w:ind w:firstLine="480"/>
+              <w:pStyle w:val="afb"/>
             </w:pPr>
           </w:p>
         </w:tc>
@@ -18251,7 +18303,7 @@
           </w:tcPr>
           <w:p>
             <w:pPr>
-              <w:ind w:firstLine="480"/>
+              <w:pStyle w:val="afb"/>
             </w:pPr>
             <w:r>
               <w:t>MMIM</w:t>
@@ -18264,7 +18316,7 @@
           </w:tcPr>
           <w:p>
             <w:pPr>
-              <w:ind w:firstLine="480"/>
+              <w:pStyle w:val="afb"/>
             </w:pPr>
             <w:r>
               <w:t>45.0</w:t>
@@ -18277,7 +18329,7 @@
           </w:tcPr>
           <w:p>
             <w:pPr>
-              <w:ind w:firstLine="480"/>
+              <w:pStyle w:val="afb"/>
             </w:pPr>
             <w:r>
               <w:t>83.0</w:t>
@@ -18290,7 +18342,7 @@
           </w:tcPr>
           <w:p>
             <w:pPr>
-              <w:ind w:firstLine="480"/>
+              <w:pStyle w:val="afb"/>
             </w:pPr>
             <w:r>
               <w:t>82.9</w:t>
@@ -18303,7 +18355,7 @@
           </w:tcPr>
           <w:p>
             <w:pPr>
-              <w:ind w:firstLine="480"/>
+              <w:pStyle w:val="afb"/>
             </w:pPr>
             <w:r>
               <w:t>0.738</w:t>
@@ -18316,7 +18368,7 @@
           </w:tcPr>
           <w:p>
             <w:pPr>
-              <w:ind w:firstLine="480"/>
+              <w:pStyle w:val="afb"/>
             </w:pPr>
             <w:r>
               <w:t>0.781</w:t>
@@ -18329,7 +18381,7 @@
           </w:tcPr>
           <w:p>
             <w:pPr>
-              <w:ind w:firstLine="480"/>
+              <w:pStyle w:val="afb"/>
             </w:pPr>
           </w:p>
         </w:tc>
@@ -18341,10 +18393,9 @@
           </w:tcPr>
           <w:p>
             <w:pPr>
-              <w:ind w:firstLine="480"/>
-            </w:pPr>
-            <w:r>
-              <w:lastRenderedPageBreak/>
+              <w:pStyle w:val="afb"/>
+            </w:pPr>
+            <w:r>
               <w:t>DMD</w:t>
             </w:r>
           </w:p>
@@ -18355,7 +18406,7 @@
           </w:tcPr>
           <w:p>
             <w:pPr>
-              <w:ind w:firstLine="480"/>
+              <w:pStyle w:val="afb"/>
             </w:pPr>
             <w:r>
               <w:t>46.4</w:t>
@@ -18368,7 +18419,7 @@
           </w:tcPr>
           <w:p>
             <w:pPr>
-              <w:ind w:firstLine="480"/>
+              <w:pStyle w:val="afb"/>
             </w:pPr>
             <w:r>
               <w:t>84.2</w:t>
@@ -18381,7 +18432,7 @@
           </w:tcPr>
           <w:p>
             <w:pPr>
-              <w:ind w:firstLine="480"/>
+              <w:pStyle w:val="afb"/>
             </w:pPr>
             <w:r>
               <w:t>84.1</w:t>
@@ -18394,7 +18445,7 @@
           </w:tcPr>
           <w:p>
             <w:pPr>
-              <w:ind w:firstLine="480"/>
+              <w:pStyle w:val="afb"/>
             </w:pPr>
             <w:r>
               <w:t>0.709</w:t>
@@ -18407,7 +18458,7 @@
           </w:tcPr>
           <w:p>
             <w:pPr>
-              <w:ind w:firstLine="480"/>
+              <w:pStyle w:val="afb"/>
             </w:pPr>
             <w:r>
               <w:t>0.796</w:t>
@@ -18420,7 +18471,7 @@
           </w:tcPr>
           <w:p>
             <w:pPr>
-              <w:ind w:firstLine="480"/>
+              <w:pStyle w:val="afb"/>
             </w:pPr>
           </w:p>
         </w:tc>
@@ -18432,7 +18483,7 @@
           </w:tcPr>
           <w:p>
             <w:pPr>
-              <w:ind w:firstLine="480"/>
+              <w:pStyle w:val="afb"/>
             </w:pPr>
             <w:r>
               <w:t>ITHP</w:t>
@@ -18445,7 +18496,7 @@
           </w:tcPr>
           <w:p>
             <w:pPr>
-              <w:ind w:firstLine="480"/>
+              <w:pStyle w:val="afb"/>
             </w:pPr>
             <w:r>
               <w:t>47.7</w:t>
@@ -18458,7 +18509,7 @@
           </w:tcPr>
           <w:p>
             <w:pPr>
-              <w:ind w:firstLine="480"/>
+              <w:pStyle w:val="afb"/>
             </w:pPr>
             <w:r>
               <w:t>86.1</w:t>
@@ -18471,7 +18522,7 @@
           </w:tcPr>
           <w:p>
             <w:pPr>
-              <w:ind w:firstLine="480"/>
+              <w:pStyle w:val="afb"/>
             </w:pPr>
             <w:r>
               <w:t>86.1</w:t>
@@ -18484,7 +18535,7 @@
           </w:tcPr>
           <w:p>
             <w:pPr>
-              <w:ind w:firstLine="480"/>
+              <w:pStyle w:val="afb"/>
             </w:pPr>
             <w:r>
               <w:t>0.663</w:t>
@@ -18497,7 +18548,7 @@
           </w:tcPr>
           <w:p>
             <w:pPr>
-              <w:ind w:firstLine="480"/>
+              <w:pStyle w:val="afb"/>
             </w:pPr>
             <w:r>
               <w:t>0.856</w:t>
@@ -18510,7 +18561,7 @@
           </w:tcPr>
           <w:p>
             <w:pPr>
-              <w:ind w:firstLine="480"/>
+              <w:pStyle w:val="afb"/>
             </w:pPr>
           </w:p>
         </w:tc>
@@ -18522,7 +18573,7 @@
           </w:tcPr>
           <w:p>
             <w:pPr>
-              <w:ind w:firstLine="480"/>
+              <w:pStyle w:val="afb"/>
             </w:pPr>
             <w:r>
               <w:t>MCL-MCF</w:t>
@@ -18535,7 +18586,7 @@
           </w:tcPr>
           <w:p>
             <w:pPr>
-              <w:ind w:firstLine="480"/>
+              <w:pStyle w:val="afb"/>
             </w:pPr>
             <w:r>
               <w:t>—</w:t>
@@ -18548,7 +18599,7 @@
           </w:tcPr>
           <w:p>
             <w:pPr>
-              <w:ind w:firstLine="480"/>
+              <w:pStyle w:val="afb"/>
             </w:pPr>
             <w:r>
               <w:t>84.9</w:t>
@@ -18561,7 +18612,7 @@
           </w:tcPr>
           <w:p>
             <w:pPr>
-              <w:ind w:firstLine="480"/>
+              <w:pStyle w:val="afb"/>
             </w:pPr>
             <w:r>
               <w:t>84.7</w:t>
@@ -18574,7 +18625,7 @@
           </w:tcPr>
           <w:p>
             <w:pPr>
-              <w:ind w:firstLine="480"/>
+              <w:pStyle w:val="afb"/>
             </w:pPr>
             <w:r>
               <w:t>0.692</w:t>
@@ -18587,7 +18638,7 @@
           </w:tcPr>
           <w:p>
             <w:pPr>
-              <w:ind w:firstLine="480"/>
+              <w:pStyle w:val="afb"/>
             </w:pPr>
             <w:r>
               <w:t>0.799</w:t>
@@ -18600,7 +18651,7 @@
           </w:tcPr>
           <w:p>
             <w:pPr>
-              <w:ind w:firstLine="480"/>
+              <w:pStyle w:val="afb"/>
             </w:pPr>
           </w:p>
         </w:tc>
@@ -18612,7 +18663,7 @@
           </w:tcPr>
           <w:p>
             <w:pPr>
-              <w:ind w:firstLine="480"/>
+              <w:pStyle w:val="afb"/>
             </w:pPr>
             <w:proofErr w:type="spellStart"/>
             <w:r>
@@ -18627,7 +18678,7 @@
           </w:tcPr>
           <w:p>
             <w:pPr>
-              <w:ind w:firstLine="480"/>
+              <w:pStyle w:val="afb"/>
             </w:pPr>
             <w:r>
               <w:t>42.27</w:t>
@@ -18640,7 +18691,7 @@
           </w:tcPr>
           <w:p>
             <w:pPr>
-              <w:ind w:firstLine="480"/>
+              <w:pStyle w:val="afb"/>
             </w:pPr>
             <w:r>
               <w:t>84.17</w:t>
@@ -18653,7 +18704,7 @@
           </w:tcPr>
           <w:p>
             <w:pPr>
-              <w:ind w:firstLine="480"/>
+              <w:pStyle w:val="afb"/>
             </w:pPr>
             <w:r>
               <w:t>84.13</w:t>
@@ -18666,7 +18717,7 @@
           </w:tcPr>
           <w:p>
             <w:pPr>
-              <w:ind w:firstLine="480"/>
+              <w:pStyle w:val="afb"/>
             </w:pPr>
             <w:r>
               <w:t>0.742</w:t>
@@ -18679,7 +18730,7 @@
           </w:tcPr>
           <w:p>
             <w:pPr>
-              <w:ind w:firstLine="480"/>
+              <w:pStyle w:val="afb"/>
             </w:pPr>
             <w:r>
               <w:t>0.790</w:t>
@@ -18692,7 +18743,7 @@
           </w:tcPr>
           <w:p>
             <w:pPr>
-              <w:ind w:firstLine="480"/>
+              <w:pStyle w:val="afb"/>
             </w:pPr>
           </w:p>
         </w:tc>
@@ -18704,7 +18755,7 @@
           </w:tcPr>
           <w:p>
             <w:pPr>
-              <w:ind w:firstLine="480"/>
+              <w:pStyle w:val="afb"/>
             </w:pPr>
             <w:r>
               <w:t>CLGSI</w:t>
@@ -18717,7 +18768,7 @@
           </w:tcPr>
           <w:p>
             <w:pPr>
-              <w:ind w:firstLine="480"/>
+              <w:pStyle w:val="afb"/>
             </w:pPr>
             <w:r>
               <w:t>47.96</w:t>
@@ -18730,7 +18781,7 @@
           </w:tcPr>
           <w:p>
             <w:pPr>
-              <w:ind w:firstLine="480"/>
+              <w:pStyle w:val="afb"/>
             </w:pPr>
             <w:r>
               <w:t>83.97</w:t>
@@ -18743,7 +18794,7 @@
           </w:tcPr>
           <w:p>
             <w:pPr>
-              <w:ind w:firstLine="480"/>
+              <w:pStyle w:val="afb"/>
             </w:pPr>
             <w:r>
               <w:t>83.63</w:t>
@@ -18756,7 +18807,7 @@
           </w:tcPr>
           <w:p>
             <w:pPr>
-              <w:ind w:firstLine="480"/>
+              <w:pStyle w:val="afb"/>
             </w:pPr>
             <w:r>
               <w:t>0.703</w:t>
@@ -18769,7 +18820,7 @@
           </w:tcPr>
           <w:p>
             <w:pPr>
-              <w:ind w:firstLine="480"/>
+              <w:pStyle w:val="afb"/>
             </w:pPr>
             <w:r>
               <w:t>0.790</w:t>
@@ -18782,7 +18833,7 @@
           </w:tcPr>
           <w:p>
             <w:pPr>
-              <w:ind w:firstLine="480"/>
+              <w:pStyle w:val="afb"/>
             </w:pPr>
           </w:p>
         </w:tc>
@@ -18794,7 +18845,7 @@
           </w:tcPr>
           <w:p>
             <w:pPr>
-              <w:ind w:firstLine="480"/>
+              <w:pStyle w:val="afb"/>
             </w:pPr>
             <w:proofErr w:type="spellStart"/>
             <w:r>
@@ -18809,7 +18860,7 @@
           </w:tcPr>
           <w:p>
             <w:pPr>
-              <w:ind w:firstLine="480"/>
+              <w:pStyle w:val="afb"/>
             </w:pPr>
             <w:r>
               <w:t>48.68</w:t>
@@ -18822,7 +18873,7 @@
           </w:tcPr>
           <w:p>
             <w:pPr>
-              <w:ind w:firstLine="480"/>
+              <w:pStyle w:val="afb"/>
             </w:pPr>
             <w:r>
               <w:t>85.85</w:t>
@@ -18835,7 +18886,7 @@
           </w:tcPr>
           <w:p>
             <w:pPr>
-              <w:ind w:firstLine="480"/>
+              <w:pStyle w:val="afb"/>
             </w:pPr>
             <w:r>
               <w:t>85.83</w:t>
@@ -18848,7 +18899,7 @@
           </w:tcPr>
           <w:p>
             <w:pPr>
-              <w:ind w:firstLine="480"/>
+              <w:pStyle w:val="afb"/>
             </w:pPr>
             <w:r>
               <w:t>0.691</w:t>
@@ -18861,7 +18912,7 @@
           </w:tcPr>
           <w:p>
             <w:pPr>
-              <w:ind w:firstLine="480"/>
+              <w:pStyle w:val="afb"/>
             </w:pPr>
             <w:r>
               <w:t>0.809</w:t>
@@ -18874,7 +18925,7 @@
           </w:tcPr>
           <w:p>
             <w:pPr>
-              <w:ind w:firstLine="480"/>
+              <w:pStyle w:val="afb"/>
             </w:pPr>
           </w:p>
         </w:tc>
@@ -18886,7 +18937,7 @@
           </w:tcPr>
           <w:p>
             <w:pPr>
-              <w:ind w:firstLine="480"/>
+              <w:pStyle w:val="afb"/>
             </w:pPr>
             <w:r>
               <w:t>MGT</w:t>
@@ -18899,7 +18950,7 @@
           </w:tcPr>
           <w:p>
             <w:pPr>
-              <w:ind w:firstLine="480"/>
+              <w:pStyle w:val="afb"/>
             </w:pPr>
             <w:r>
               <w:t>50.44</w:t>
@@ -18912,7 +18963,7 @@
           </w:tcPr>
           <w:p>
             <w:pPr>
-              <w:ind w:firstLine="480"/>
+              <w:pStyle w:val="afb"/>
             </w:pPr>
             <w:r>
               <w:t>86.30</w:t>
@@ -18925,7 +18976,7 @@
           </w:tcPr>
           <w:p>
             <w:pPr>
-              <w:ind w:firstLine="480"/>
+              <w:pStyle w:val="afb"/>
             </w:pPr>
             <w:r>
               <w:t>86.28</w:t>
@@ -18938,7 +18989,7 @@
           </w:tcPr>
           <w:p>
             <w:pPr>
-              <w:ind w:firstLine="480"/>
+              <w:pStyle w:val="afb"/>
             </w:pPr>
             <w:r>
               <w:t>0.659</w:t>
@@ -18951,7 +19002,7 @@
           </w:tcPr>
           <w:p>
             <w:pPr>
-              <w:ind w:firstLine="480"/>
+              <w:pStyle w:val="afb"/>
             </w:pPr>
             <w:r>
               <w:t>0.822</w:t>
@@ -18964,7 +19015,7 @@
           </w:tcPr>
           <w:p>
             <w:pPr>
-              <w:ind w:firstLine="480"/>
+              <w:pStyle w:val="afb"/>
             </w:pPr>
           </w:p>
         </w:tc>
@@ -18977,7 +19028,7 @@
           </w:tcPr>
           <w:p>
             <w:pPr>
-              <w:ind w:firstLine="480"/>
+              <w:pStyle w:val="afb"/>
             </w:pPr>
             <w:r>
               <w:t>SACF (seed=42)</w:t>
@@ -18991,7 +19042,7 @@
           </w:tcPr>
           <w:p>
             <w:pPr>
-              <w:ind w:firstLine="480"/>
+              <w:pStyle w:val="afb"/>
             </w:pPr>
             <w:r>
               <w:t>51.60</w:t>
@@ -19005,7 +19056,7 @@
           </w:tcPr>
           <w:p>
             <w:pPr>
-              <w:ind w:firstLine="480"/>
+              <w:pStyle w:val="afb"/>
             </w:pPr>
             <w:r>
               <w:t>85.86</w:t>
@@ -19019,7 +19070,7 @@
           </w:tcPr>
           <w:p>
             <w:pPr>
-              <w:ind w:firstLine="480"/>
+              <w:pStyle w:val="afb"/>
             </w:pPr>
             <w:r>
               <w:t>85.84</w:t>
@@ -19033,7 +19084,7 @@
           </w:tcPr>
           <w:p>
             <w:pPr>
-              <w:ind w:firstLine="480"/>
+              <w:pStyle w:val="afb"/>
             </w:pPr>
             <w:r>
               <w:t>0.596</w:t>
@@ -19047,7 +19098,7 @@
           </w:tcPr>
           <w:p>
             <w:pPr>
-              <w:ind w:firstLine="480"/>
+              <w:pStyle w:val="afb"/>
             </w:pPr>
             <w:r>
               <w:t>0.864</w:t>
@@ -19061,7 +19112,7 @@
           </w:tcPr>
           <w:p>
             <w:pPr>
-              <w:ind w:firstLine="480"/>
+              <w:pStyle w:val="afb"/>
             </w:pPr>
             <w:r>
               <w:t>本研究</w:t>
@@ -19077,7 +19128,7 @@
           </w:tcPr>
           <w:p>
             <w:pPr>
-              <w:ind w:firstLine="480"/>
+              <w:pStyle w:val="afb"/>
             </w:pPr>
             <w:r>
               <w:t>SACF (seed=123)</w:t>
@@ -19091,7 +19142,7 @@
           </w:tcPr>
           <w:p>
             <w:pPr>
-              <w:ind w:firstLine="480"/>
+              <w:pStyle w:val="afb"/>
             </w:pPr>
             <w:r>
               <w:t>50.00</w:t>
@@ -19105,7 +19156,7 @@
           </w:tcPr>
           <w:p>
             <w:pPr>
-              <w:ind w:firstLine="480"/>
+              <w:pStyle w:val="afb"/>
             </w:pPr>
             <w:r>
               <w:t>85.28</w:t>
@@ -19119,7 +19170,7 @@
           </w:tcPr>
           <w:p>
             <w:pPr>
-              <w:ind w:firstLine="480"/>
+              <w:pStyle w:val="afb"/>
             </w:pPr>
             <w:r>
               <w:t>85.25</w:t>
@@ -19133,7 +19184,7 @@
           </w:tcPr>
           <w:p>
             <w:pPr>
-              <w:ind w:firstLine="480"/>
+              <w:pStyle w:val="afb"/>
             </w:pPr>
             <w:r>
               <w:t>0.609</w:t>
@@ -19147,7 +19198,7 @@
           </w:tcPr>
           <w:p>
             <w:pPr>
-              <w:ind w:firstLine="480"/>
+              <w:pStyle w:val="afb"/>
             </w:pPr>
             <w:r>
               <w:t>0.860</w:t>
@@ -19161,7 +19212,7 @@
           </w:tcPr>
           <w:p>
             <w:pPr>
-              <w:ind w:firstLine="480"/>
+              <w:pStyle w:val="afb"/>
             </w:pPr>
             <w:r>
               <w:t>本研究</w:t>
@@ -19177,9 +19228,10 @@
           </w:tcPr>
           <w:p>
             <w:pPr>
-              <w:ind w:firstLine="480"/>
-            </w:pPr>
-            <w:r>
+              <w:pStyle w:val="afb"/>
+            </w:pPr>
+            <w:r>
+              <w:lastRenderedPageBreak/>
               <w:t>SACF (seed=2024)</w:t>
             </w:r>
           </w:p>
@@ -19191,7 +19243,7 @@
           </w:tcPr>
           <w:p>
             <w:pPr>
-              <w:ind w:firstLine="480"/>
+              <w:pStyle w:val="afb"/>
             </w:pPr>
             <w:r>
               <w:t>49.42</w:t>
@@ -19205,7 +19257,7 @@
           </w:tcPr>
           <w:p>
             <w:pPr>
-              <w:ind w:firstLine="480"/>
+              <w:pStyle w:val="afb"/>
             </w:pPr>
             <w:r>
               <w:t>85.42</w:t>
@@ -19219,7 +19271,7 @@
           </w:tcPr>
           <w:p>
             <w:pPr>
-              <w:ind w:firstLine="480"/>
+              <w:pStyle w:val="afb"/>
             </w:pPr>
             <w:r>
               <w:t>85.41</w:t>
@@ -19233,7 +19285,7 @@
           </w:tcPr>
           <w:p>
             <w:pPr>
-              <w:ind w:firstLine="480"/>
+              <w:pStyle w:val="afb"/>
             </w:pPr>
             <w:r>
               <w:t>0.597</w:t>
@@ -19247,7 +19299,7 @@
           </w:tcPr>
           <w:p>
             <w:pPr>
-              <w:ind w:firstLine="480"/>
+              <w:pStyle w:val="afb"/>
             </w:pPr>
             <w:r>
               <w:t>0.861</w:t>
@@ -19261,7 +19313,7 @@
           </w:tcPr>
           <w:p>
             <w:pPr>
-              <w:ind w:firstLine="480"/>
+              <w:pStyle w:val="afb"/>
             </w:pPr>
             <w:r>
               <w:t>本研究</w:t>
@@ -19277,7 +19329,7 @@
           </w:tcPr>
           <w:p>
             <w:pPr>
-              <w:ind w:firstLine="480"/>
+              <w:pStyle w:val="afb"/>
             </w:pPr>
             <w:r>
               <w:t>SACF</w:t>
@@ -19294,7 +19346,7 @@
           </w:tcPr>
           <w:p>
             <w:pPr>
-              <w:ind w:firstLine="480"/>
+              <w:pStyle w:val="afb"/>
             </w:pPr>
             <w:r>
               <w:t>52.19</w:t>
@@ -19308,7 +19360,7 @@
           </w:tcPr>
           <w:p>
             <w:pPr>
-              <w:ind w:firstLine="480"/>
+              <w:pStyle w:val="afb"/>
             </w:pPr>
             <w:r>
               <w:t>86.30</w:t>
@@ -19322,7 +19374,7 @@
           </w:tcPr>
           <w:p>
             <w:pPr>
-              <w:ind w:firstLine="480"/>
+              <w:pStyle w:val="afb"/>
             </w:pPr>
             <w:r>
               <w:t>86.28</w:t>
@@ -19336,7 +19388,7 @@
           </w:tcPr>
           <w:p>
             <w:pPr>
-              <w:ind w:firstLine="480"/>
+              <w:pStyle w:val="afb"/>
             </w:pPr>
             <w:r>
               <w:t>0.587</w:t>
@@ -19350,7 +19402,7 @@
           </w:tcPr>
           <w:p>
             <w:pPr>
-              <w:ind w:firstLine="480"/>
+              <w:pStyle w:val="afb"/>
             </w:pPr>
             <w:r>
               <w:t>0.869</w:t>
@@ -19364,7 +19416,7 @@
           </w:tcPr>
           <w:p>
             <w:pPr>
-              <w:ind w:firstLine="480"/>
+              <w:pStyle w:val="afb"/>
             </w:pPr>
             <w:r>
               <w:t>本研究</w:t>
@@ -19431,7 +19483,6 @@
         <w:ind w:firstLine="480"/>
       </w:pPr>
       <w:r>
-        <w:lastRenderedPageBreak/>
         <w:t>Acc-7</w:t>
       </w:r>
       <w:r>
@@ -19843,7 +19894,11 @@
         <w:t xml:space="preserve"> Corr </w:t>
       </w:r>
       <w:r>
-        <w:t>指標上，三個種子均高於</w:t>
+        <w:t>指</w:t>
+      </w:r>
+      <w:r>
+        <w:lastRenderedPageBreak/>
+        <w:t>標上，三個種子均高於</w:t>
       </w:r>
       <w:r>
         <w:t xml:space="preserve"> 0.860</w:t>
@@ -19917,7 +19972,6 @@
         <w:ind w:firstLine="480"/>
       </w:pPr>
       <w:r>
-        <w:lastRenderedPageBreak/>
         <w:t xml:space="preserve">Acc-7 </w:t>
       </w:r>
       <w:r>
@@ -20186,6 +20240,7 @@
       <w:bookmarkStart w:id="63" w:name="_Toc229060256"/>
       <w:proofErr w:type="spellStart"/>
       <w:r>
+        <w:lastRenderedPageBreak/>
         <w:t>MMAFFBen</w:t>
       </w:r>
       <w:proofErr w:type="spellEnd"/>
@@ -20304,7 +20359,6 @@
         <w:t xml:space="preserve"> EWECT-virus</w:t>
       </w:r>
       <w:r>
-        <w:lastRenderedPageBreak/>
         <w:t>（中文，六類情緒分類，</w:t>
       </w:r>
       <w:r>
@@ -22163,7 +22217,11 @@
       </w:r>
       <w:proofErr w:type="spellEnd"/>
       <w:r>
-        <w:t>（中文二分類情感極性）任務上達到</w:t>
+        <w:t>（中文二</w:t>
+      </w:r>
+      <w:r>
+        <w:lastRenderedPageBreak/>
+        <w:t>分類情感極性）任務上達到</w:t>
       </w:r>
       <w:r>
         <w:t xml:space="preserve"> 93.42</w:t>
@@ -22283,11 +22341,7 @@
         <w:t xml:space="preserve">XED </w:t>
       </w:r>
       <w:r>
-        <w:t>多標籤多語情</w:t>
-      </w:r>
-      <w:r>
-        <w:lastRenderedPageBreak/>
-        <w:t>緒任務（</w:t>
+        <w:t>多標籤多語情緒任務（</w:t>
       </w:r>
       <w:r>
         <w:t>14.33</w:t>
@@ -22888,6 +22942,7 @@
               <w:ind w:firstLine="480"/>
             </w:pPr>
             <w:r>
+              <w:lastRenderedPageBreak/>
               <w:t>MMAFFLM-7b</w:t>
             </w:r>
           </w:p>
@@ -23208,7 +23263,6 @@
               <w:ind w:firstLine="480"/>
             </w:pPr>
             <w:r>
-              <w:lastRenderedPageBreak/>
               <w:t>Llama3.2-1b-instruct</w:t>
             </w:r>
           </w:p>
@@ -23571,7 +23625,11 @@
         <w:t xml:space="preserve"> DeBERTa-v3-large </w:t>
       </w:r>
       <w:r>
-        <w:t>骨幹；（</w:t>
+        <w:t>骨</w:t>
+      </w:r>
+      <w:r>
+        <w:lastRenderedPageBreak/>
+        <w:t>幹；（</w:t>
       </w:r>
       <w:r>
         <w:t>2</w:t>
@@ -23709,7 +23767,6 @@
               <w:ind w:firstLine="480"/>
             </w:pPr>
             <w:r>
-              <w:lastRenderedPageBreak/>
               <w:t>評估指標</w:t>
             </w:r>
           </w:p>
@@ -24521,7 +24578,11 @@
         <w:t>α=0.05</w:t>
       </w:r>
       <w:r>
-        <w:t>），表示兩個模型版本在分類決策層面的差異屬於隨機噪音，而非系統性退步。深入分析揭示一個重要的統計現象：未經領域自適應預訓練的三種子個別</w:t>
+        <w:t>），表示兩個模型版本在分類決策層面的差異屬於隨機噪音，而非系統性退步。深入分析揭示一個重要的統計現象：未經領域自適應預訓</w:t>
+      </w:r>
+      <w:r>
+        <w:lastRenderedPageBreak/>
+        <w:t>練的三種子個別</w:t>
       </w:r>
       <w:r>
         <w:t xml:space="preserve"> Acc-7 </w:t>
@@ -24649,7 +24710,6 @@
         <w:ind w:firstLine="480"/>
       </w:pPr>
       <w:r>
-        <w:lastRenderedPageBreak/>
         <w:t>在細粒度效能上，</w:t>
       </w:r>
       <w:proofErr w:type="spellStart"/>
@@ -24978,6 +25038,7 @@
               <w:ind w:firstLine="480"/>
             </w:pPr>
             <w:r>
+              <w:lastRenderedPageBreak/>
               <w:t>模型</w:t>
             </w:r>
           </w:p>
@@ -25264,7 +25325,6 @@
               <w:ind w:firstLine="480"/>
             </w:pPr>
             <w:r>
-              <w:lastRenderedPageBreak/>
               <w:t>EmoLlama-chat-7b</w:t>
             </w:r>
           </w:p>
@@ -25781,6 +25841,7 @@
         <w:ind w:firstLine="480"/>
       </w:pPr>
       <w:r>
+        <w:lastRenderedPageBreak/>
         <w:t>（</w:t>
       </w:r>
       <w:r>
@@ -25833,7 +25894,6 @@
         <w:ind w:firstLine="480"/>
       </w:pPr>
       <w:r>
-        <w:lastRenderedPageBreak/>
         <w:t>（</w:t>
       </w:r>
       <w:r>
@@ -26162,7 +26222,11 @@
         <w:t xml:space="preserve"> </w:t>
       </w:r>
       <w:r>
-        <w:t>合併訓練）及評估協議的不同，不構成直接可比較關係。整體而言，</w:t>
+        <w:t>合併訓練）及評估協議的不同，</w:t>
+      </w:r>
+      <w:r>
+        <w:lastRenderedPageBreak/>
+        <w:t>不構成直接可比較關係。整體而言，</w:t>
       </w:r>
       <w:r>
         <w:t xml:space="preserve">SACF </w:t>
@@ -26224,11 +26288,7 @@
         <w:t xml:space="preserve">inter-annotator agreement </w:t>
       </w:r>
       <w:r>
-        <w:t>有限），使得該指標的天花板效應顯著。本研究透過</w:t>
-      </w:r>
-      <w:r>
-        <w:lastRenderedPageBreak/>
-        <w:t>集成與推斷增強策略已充分挖掘現有架構的潛力，進一步突破可能需要更大規模的預訓練語言模型（如</w:t>
+        <w:t>有限），使得該指標的天花板效應顯著。本研究透過集成與推斷增強策略已充分挖掘現有架構的潛力，進一步突破可能需要更大規模的預訓練語言模型（如</w:t>
       </w:r>
       <w:r>
         <w:t xml:space="preserve"> </w:t>

</xml_diff>